<commit_message>
feat(table): add Table.width property
Add support for setting table preferred width via Table.width property.
This allows programmatic control of the "Preferred width" checkbox in
Word's Table Properties dialog, enabling true fixed-width behavior.

- Add Table.width property (read/write)
- Add CT_TblPr.width property
- Register w:tblW element
- Add unit tests and BDD scenarios
- Add documentation to table-props.rst

Implements #1305
</commit_message>
<xml_diff>
--- a/features/steps/test_files/tbl-props.docx
+++ b/features/steps/test_files/tbl-props.docx
@@ -24,7 +24,6 @@
     <w:tbl>
       <w:tblPr>
         <w:tblStyle w:val="TableGrid"/>
-        <w:tblW w:w="0" w:type="auto"/>
         <w:tblCellMar>
           <w:left w:w="115" w:type="dxa"/>
           <w:right w:w="115" w:type="dxa"/>
@@ -494,6 +493,116 @@
       </w:tr>
     </w:tbl>
     <w:p/>
+    <w:p/>
+    <w:tbl>
+      <w:tblPr>
+        <w:tblW w:type="dxa" w:w="1440"/>
+        <w:tblLook w:firstColumn="1" w:firstRow="1" w:lastColumn="0" w:lastRow="0" w:noHBand="0" w:noVBand="1" w:val="04A0"/>
+      </w:tblPr>
+      <w:tblGrid>
+        <w:gridCol w:w="4320"/>
+        <w:gridCol w:w="4320"/>
+      </w:tblGrid>
+      <w:tr>
+        <w:tc>
+          <w:tcPr>
+            <w:tcW w:type="dxa" w:w="4320"/>
+          </w:tcPr>
+          <w:p>
+            <w:r>
+              <w:t>R1C1</w:t>
+            </w:r>
+          </w:p>
+        </w:tc>
+        <w:tc>
+          <w:tcPr>
+            <w:tcW w:type="dxa" w:w="4320"/>
+          </w:tcPr>
+          <w:p>
+            <w:r>
+              <w:t>R1C2</w:t>
+            </w:r>
+          </w:p>
+        </w:tc>
+      </w:tr>
+      <w:tr>
+        <w:tc>
+          <w:tcPr>
+            <w:tcW w:type="dxa" w:w="4320"/>
+          </w:tcPr>
+          <w:p>
+            <w:r>
+              <w:t>R2C1</w:t>
+            </w:r>
+          </w:p>
+        </w:tc>
+        <w:tc>
+          <w:tcPr>
+            <w:tcW w:type="dxa" w:w="4320"/>
+          </w:tcPr>
+          <w:p>
+            <w:r>
+              <w:t>R2C2</w:t>
+            </w:r>
+          </w:p>
+        </w:tc>
+      </w:tr>
+    </w:tbl>
+    <w:p/>
+    <w:tbl>
+      <w:tblPr>
+        <w:tblW w:type="dxa" w:w="8640"/>
+        <w:tblLook w:firstColumn="1" w:firstRow="1" w:lastColumn="0" w:lastRow="0" w:noHBand="0" w:noVBand="1" w:val="04A0"/>
+      </w:tblPr>
+      <w:tblGrid>
+        <w:gridCol w:w="4320"/>
+        <w:gridCol w:w="4320"/>
+      </w:tblGrid>
+      <w:tr>
+        <w:tc>
+          <w:tcPr>
+            <w:tcW w:type="dxa" w:w="4320"/>
+          </w:tcPr>
+          <w:p>
+            <w:r>
+              <w:t>R1C1</w:t>
+            </w:r>
+          </w:p>
+        </w:tc>
+        <w:tc>
+          <w:tcPr>
+            <w:tcW w:type="dxa" w:w="4320"/>
+          </w:tcPr>
+          <w:p>
+            <w:r>
+              <w:t>R1C2</w:t>
+            </w:r>
+          </w:p>
+        </w:tc>
+      </w:tr>
+      <w:tr>
+        <w:tc>
+          <w:tcPr>
+            <w:tcW w:type="dxa" w:w="4320"/>
+          </w:tcPr>
+          <w:p>
+            <w:r>
+              <w:t>R2C1</w:t>
+            </w:r>
+          </w:p>
+        </w:tc>
+        <w:tc>
+          <w:tcPr>
+            <w:tcW w:type="dxa" w:w="4320"/>
+          </w:tcPr>
+          <w:p>
+            <w:r>
+              <w:t>R2C2</w:t>
+            </w:r>
+          </w:p>
+        </w:tc>
+      </w:tr>
+    </w:tbl>
     <w:sectPr>
       <w:pgSz w:w="12240" w:h="15840"/>
       <w:pgMar w:top="1440" w:right="1800" w:bottom="1440" w:left="1800" w:header="720" w:footer="720" w:gutter="0"/>

</xml_diff>